<commit_message>
fix: vary "designed" verbs in resume bullets
8 uses of designed/Designed reduced to 3; each replacement matches the
bullet's substance (Launched/Introduced/Streamlined/Reworked/Delivered/
Created). Docx regenerated to match.

Co-Authored-By: Claude Fable 5 <noreply@anthropic.com>
Claude-Session: https://claude.ai/code/session_012GhSJs8YUzcFpuhd8VSfWz
</commit_message>
<xml_diff>
--- a/files/Edward Stone Resume.docx
+++ b/files/Edward Stone Resume.docx
@@ -195,7 +195,7 @@
         <w:rPr>
           <w:sz w:val="21"/>
         </w:rPr>
-        <w:t>Designed a planning feature aligning Inquisitive's content library with teachers' real classroom schedules, adopted by over half of active users and now a key indicator of customer engagement and retention.</w:t>
+        <w:t>Launched a planning feature aligning Inquisitive's content library with teachers' real classroom schedules, adopted by over half of active users and now a key indicator of customer engagement and retention.</w:t>
       </w:r>
     </w:p>
     <w:p>
@@ -207,7 +207,7 @@
         <w:rPr>
           <w:sz w:val="21"/>
         </w:rPr>
-        <w:t>Designed and shipped an in-product review system for teachers to rate lessons, generating 7,000+ responses in its pilot year. Feedback drives weekly content improvements, surfaces product insights, and provides a pipeline of engaged users for research recruitment.</w:t>
+        <w:t>Introduced an in-product review system for teachers to rate lessons, generating 7,000+ responses in its pilot year. Feedback drives weekly content improvements, surfaces product insights, and provides a pipeline of engaged users for research recruitment.</w:t>
       </w:r>
     </w:p>
     <w:p>
@@ -308,7 +308,7 @@
         <w:rPr>
           <w:sz w:val="21"/>
         </w:rPr>
-        <w:t>Redesigned the organiser onboarding flow to reduce friction in creating events, addressing the platform's core supply-side challenge.</w:t>
+        <w:t>Streamlined the organiser onboarding flow to reduce friction in creating events, addressing the platform's core supply-side challenge.</w:t>
       </w:r>
     </w:p>
     <w:p>
@@ -373,7 +373,7 @@
         <w:rPr>
           <w:sz w:val="21"/>
         </w:rPr>
-        <w:t>Re-designed EDM campaigns, increasing conversion rate by over 20%.</w:t>
+        <w:t>Reworked EDM campaigns, increasing conversion rate by over 20%.</w:t>
       </w:r>
     </w:p>
     <w:p>
@@ -479,7 +479,7 @@
           <w:i w:val="0"/>
           <w:sz w:val="21"/>
         </w:rPr>
-        <w:t>Graphic designer for Sir Elton John's private office, Rocket Sports (sports management), and Rocket Music (music management). Designed for Olympic-level athletes and entertainment industry clients.</w:t>
+        <w:t>Graphic designer for Sir Elton John's private office, Rocket Sports (sports management), and Rocket Music (music management). Delivered work for Olympic-level athletes and entertainment industry clients.</w:t>
       </w:r>
     </w:p>
     <w:p>
@@ -592,7 +592,7 @@
         <w:rPr>
           <w:sz w:val="21"/>
         </w:rPr>
-        <w:t>Designed and maintained the online store, handling web design, product photography, and post-production.</w:t>
+        <w:t>Created and maintained the online store, handling web design, product photography, and post-production.</w:t>
       </w:r>
     </w:p>
     <w:p>

</xml_diff>

<commit_message>
fix: vary "designed" verbs in resume bullets (#5)
8 uses of designed/Designed reduced to 3; each replacement matches the
bullet's substance (Launched/Introduced/Streamlined/Reworked/Delivered/
Created). Docx regenerated to match.


Claude-Session: https://claude.ai/code/session_012GhSJs8YUzcFpuhd8VSfWz

Co-authored-by: Claude Fable 5 <noreply@anthropic.com>
</commit_message>
<xml_diff>
--- a/files/Edward Stone Resume.docx
+++ b/files/Edward Stone Resume.docx
@@ -195,7 +195,7 @@
         <w:rPr>
           <w:sz w:val="21"/>
         </w:rPr>
-        <w:t>Designed a planning feature aligning Inquisitive's content library with teachers' real classroom schedules, adopted by over half of active users and now a key indicator of customer engagement and retention.</w:t>
+        <w:t>Launched a planning feature aligning Inquisitive's content library with teachers' real classroom schedules, adopted by over half of active users and now a key indicator of customer engagement and retention.</w:t>
       </w:r>
     </w:p>
     <w:p>
@@ -207,7 +207,7 @@
         <w:rPr>
           <w:sz w:val="21"/>
         </w:rPr>
-        <w:t>Designed and shipped an in-product review system for teachers to rate lessons, generating 7,000+ responses in its pilot year. Feedback drives weekly content improvements, surfaces product insights, and provides a pipeline of engaged users for research recruitment.</w:t>
+        <w:t>Introduced an in-product review system for teachers to rate lessons, generating 7,000+ responses in its pilot year. Feedback drives weekly content improvements, surfaces product insights, and provides a pipeline of engaged users for research recruitment.</w:t>
       </w:r>
     </w:p>
     <w:p>
@@ -308,7 +308,7 @@
         <w:rPr>
           <w:sz w:val="21"/>
         </w:rPr>
-        <w:t>Redesigned the organiser onboarding flow to reduce friction in creating events, addressing the platform's core supply-side challenge.</w:t>
+        <w:t>Streamlined the organiser onboarding flow to reduce friction in creating events, addressing the platform's core supply-side challenge.</w:t>
       </w:r>
     </w:p>
     <w:p>
@@ -373,7 +373,7 @@
         <w:rPr>
           <w:sz w:val="21"/>
         </w:rPr>
-        <w:t>Re-designed EDM campaigns, increasing conversion rate by over 20%.</w:t>
+        <w:t>Reworked EDM campaigns, increasing conversion rate by over 20%.</w:t>
       </w:r>
     </w:p>
     <w:p>
@@ -479,7 +479,7 @@
           <w:i w:val="0"/>
           <w:sz w:val="21"/>
         </w:rPr>
-        <w:t>Graphic designer for Sir Elton John's private office, Rocket Sports (sports management), and Rocket Music (music management). Designed for Olympic-level athletes and entertainment industry clients.</w:t>
+        <w:t>Graphic designer for Sir Elton John's private office, Rocket Sports (sports management), and Rocket Music (music management). Delivered work for Olympic-level athletes and entertainment industry clients.</w:t>
       </w:r>
     </w:p>
     <w:p>
@@ -592,7 +592,7 @@
         <w:rPr>
           <w:sz w:val="21"/>
         </w:rPr>
-        <w:t>Designed and maintained the online store, handling web design, product photography, and post-production.</w:t>
+        <w:t>Created and maintained the online store, handling web design, product photography, and post-production.</w:t>
       </w:r>
     </w:p>
     <w:p>

</xml_diff>